<commit_message>
docs: fix blank page before chapter five
</commit_message>
<xml_diff>
--- a/docs/thesis/drafts/论文正文_格式修正版_程浩然_基于LangGraph的多Agent协作框架在医疗审计场景的设计与实现.docx
+++ b/docs/thesis/drafts/论文正文_格式修正版_程浩然_基于LangGraph的多Agent协作框架在医疗审计场景的设计与实现.docx
@@ -2787,7 +2787,7 @@
                 <w:b/>
                 <w:sz w:val="21"/>
               </w:rPr>
-              <w:t>37</w:t>
+              <w:t>36</w:t>
             </w:r>
           </w:p>
         </w:tc>
@@ -2846,7 +2846,7 @@
                 <w:b w:val="0"/>
                 <w:sz w:val="21"/>
               </w:rPr>
-              <w:t>37</w:t>
+              <w:t>36</w:t>
             </w:r>
           </w:p>
         </w:tc>
@@ -2905,7 +2905,7 @@
                 <w:b w:val="0"/>
                 <w:sz w:val="21"/>
               </w:rPr>
-              <w:t>38</w:t>
+              <w:t>37</w:t>
             </w:r>
           </w:p>
         </w:tc>
@@ -2964,7 +2964,7 @@
                 <w:b w:val="0"/>
                 <w:sz w:val="21"/>
               </w:rPr>
-              <w:t>41</w:t>
+              <w:t>40</w:t>
             </w:r>
           </w:p>
         </w:tc>
@@ -3023,7 +3023,7 @@
                 <w:b w:val="0"/>
                 <w:sz w:val="21"/>
               </w:rPr>
-              <w:t>44</w:t>
+              <w:t>43</w:t>
             </w:r>
           </w:p>
         </w:tc>
@@ -3082,7 +3082,7 @@
                 <w:b/>
                 <w:sz w:val="21"/>
               </w:rPr>
-              <w:t>46</w:t>
+              <w:t>45</w:t>
             </w:r>
           </w:p>
         </w:tc>
@@ -3141,7 +3141,7 @@
                 <w:b/>
                 <w:sz w:val="21"/>
               </w:rPr>
-              <w:t>47</w:t>
+              <w:t>46</w:t>
             </w:r>
           </w:p>
         </w:tc>
@@ -3200,7 +3200,7 @@
                 <w:b/>
                 <w:sz w:val="21"/>
               </w:rPr>
-              <w:t>49</w:t>
+              <w:t>48</w:t>
             </w:r>
           </w:p>
         </w:tc>
@@ -26776,13 +26776,13 @@
         <w:rPr>
           <w:lang w:eastAsia="zh-CN"/>
         </w:rPr>
-        <w:br w:type="page"/>
       </w:r>
     </w:p>
     <w:p>
       <w:pPr>
         <w:pStyle w:val="1"/>
-        <w:pageBreakBefore/>
+        <w:keepNext/>
+        <w:pageBreakBefore w:val="0"/>
         <w:spacing w:before="0" w:after="200"/>
         <w:rPr>
           <w:lang w:eastAsia="zh-CN"/>

</xml_diff>

<commit_message>
docs: fix blank space before section 5.3
</commit_message>
<xml_diff>
--- a/docs/thesis/drafts/论文正文_格式修正版_程浩然_基于LangGraph的多Agent协作框架在医疗审计场景的设计与实现.docx
+++ b/docs/thesis/drafts/论文正文_格式修正版_程浩然_基于LangGraph的多Agent协作框架在医疗审计场景的设计与实现.docx
@@ -2964,7 +2964,7 @@
                 <w:b w:val="0"/>
                 <w:sz w:val="21"/>
               </w:rPr>
-              <w:t>40</w:t>
+              <w:t>39</w:t>
             </w:r>
           </w:p>
         </w:tc>
@@ -3023,7 +3023,7 @@
                 <w:b w:val="0"/>
                 <w:sz w:val="21"/>
               </w:rPr>
-              <w:t>43</w:t>
+              <w:t>42</w:t>
             </w:r>
           </w:p>
         </w:tc>
@@ -3082,7 +3082,7 @@
                 <w:b/>
                 <w:sz w:val="21"/>
               </w:rPr>
-              <w:t>45</w:t>
+              <w:t>44</w:t>
             </w:r>
           </w:p>
         </w:tc>
@@ -3141,7 +3141,7 @@
                 <w:b/>
                 <w:sz w:val="21"/>
               </w:rPr>
-              <w:t>46</w:t>
+              <w:t>45</w:t>
             </w:r>
           </w:p>
         </w:tc>
@@ -3200,7 +3200,7 @@
                 <w:b/>
                 <w:sz w:val="21"/>
               </w:rPr>
-              <w:t>48</w:t>
+              <w:t>47</w:t>
             </w:r>
           </w:p>
         </w:tc>
@@ -29740,7 +29740,7 @@
     </w:p>
     <w:p>
       <w:pPr>
-        <w:keepNext/>
+        <w:keepNext w:val="0"/>
         <w:ind w:firstLine="480"/>
         <w:jc w:val="both"/>
         <w:rPr>

</xml_diff>

<commit_message>
docs: fix figure pagination in chapter five
</commit_message>
<xml_diff>
--- a/docs/thesis/drafts/论文正文_格式修正版_程浩然_基于LangGraph的多Agent协作框架在医疗审计场景的设计与实现.docx
+++ b/docs/thesis/drafts/论文正文_格式修正版_程浩然_基于LangGraph的多Agent协作框架在医疗审计场景的设计与实现.docx
@@ -29594,7 +29594,7 @@
     </w:p>
     <w:p>
       <w:pPr>
-        <w:keepNext/>
+        <w:keepNext w:val="0"/>
         <w:ind w:firstLine="480"/>
         <w:jc w:val="both"/>
         <w:rPr>
@@ -29847,7 +29847,7 @@
     </w:p>
     <w:p>
       <w:pPr>
-        <w:keepNext/>
+        <w:keepNext w:val="0"/>
         <w:keepLines/>
         <w:spacing w:before="80" w:after="160" w:line="300" w:lineRule="exact"/>
         <w:jc w:val="center"/>
@@ -29930,7 +29930,7 @@
     </w:p>
     <w:p>
       <w:pPr>
-        <w:keepNext/>
+        <w:keepNext w:val="0"/>
         <w:keepLines/>
         <w:spacing w:before="80" w:after="160" w:line="300" w:lineRule="exact"/>
         <w:jc w:val="center"/>
@@ -30030,7 +30030,7 @@
     </w:p>
     <w:p>
       <w:pPr>
-        <w:keepNext/>
+        <w:keepNext w:val="0"/>
         <w:keepLines/>
         <w:spacing w:before="80" w:after="160" w:line="300" w:lineRule="exact"/>
         <w:jc w:val="center"/>
@@ -30197,7 +30197,7 @@
     </w:p>
     <w:p>
       <w:pPr>
-        <w:keepNext/>
+        <w:keepNext w:val="0"/>
         <w:keepLines/>
         <w:spacing w:before="80" w:after="160" w:line="300" w:lineRule="exact"/>
         <w:jc w:val="center"/>

</xml_diff>